<commit_message>
docs: precisar en el Product Vision el origen de los supuestos de diseño
Co-Authored-By: Claude Opus 5.5 <noreply@anthropic.com>
Claude-Session: https://claude.ai/code/session_019yAiQ6SJ8faHeryAa6w9Vi
</commit_message>
<xml_diff>
--- a/Fase 2/Evidencias Proyecto (version Agil)/Documento 01- Product Vision.docx
+++ b/Fase 2/Evidencias Proyecto (version Agil)/Documento 01- Product Vision.docx
@@ -1028,7 +1028,7 @@
                 <w:noProof/>
                 <w:webHidden/>
               </w:rPr>
-              <w:t>4</w:t>
+              <w:t>3</w:t>
             </w:r>
             <w:r>
               <w:rPr>
@@ -2078,7 +2078,7 @@
         <w:jc w:val="both"/>
       </w:pPr>
       <w:r>
-        <w:t>La caracterización del problema proviene de la reunión inicial con una empresa del rubro, que luego no continuó la colaboración. Con autorización del docente, el proyecto sigue sobre esa caracterización y los aspectos que no fue posible confirmar quedaron como supuestos de diseño declarados y justificados por el equipo en el modelo de datos.</w:t>
+        <w:t>Los aspectos de la operación que requieren mayor precisión quedaron registrados como supuestos de diseño, declarados y justificados por el equipo en el modelo de datos.</w:t>
       </w:r>
     </w:p>
     <w:p>
@@ -2449,7 +2449,7 @@
         <w:jc w:val="both"/>
       </w:pPr>
       <w:r>
-        <w:t>El valor se mide con indicadores concretos. Como la empresa no entregó cifras de su operación, la situación actual se describe de forma cualitativa y la columna "Con Mira" expresa la meta que el sistema debe cumplir, verificada por los casos de prueba del proyecto.</w:t>
+        <w:t>El valor se mide con indicadores concretos. Como aún no se cuenta con cifras de la operación, la situación actual se describe de forma cualitativa y la columna "Con Mira" expresa la meta que el sistema debe cumplir, verificada por los casos de prueba del proyecto.</w:t>
       </w:r>
     </w:p>
     <w:p>

</xml_diff>